<commit_message>
Output gemäss Mockup im Projektantrag, Dict-Comprehension in V2, Elias Felder als Autor
Co-Authored-By: Claude Opus 5.5 <noreply@anthropic.com>
</commit_message>
<xml_diff>
--- a/docs/dokumentation.docx
+++ b/docs/dokumentation.docx
@@ -12,7 +12,7 @@
     </w:p>
     <w:p>
       <w:r>
-        <w:t>Projektgruppe: Aimen Labidi, Elias · Version 2.0</w:t>
+        <w:t>Projektgruppe: Aimen Labidi, Elias Felder · Version 2.0</w:t>
       </w:r>
     </w:p>
     <w:p>
@@ -55,7 +55,7 @@
           <w:p>
             <w:r/>
             <w:r>
-              <w:t>SBB-Verspätungsanalyse</w:t>
+              <w:t>SBB-Verspätungsanalyse – Pünktlichkeit an Schweizer Bahnhöfen</w:t>
             </w:r>
           </w:p>
         </w:tc>
@@ -290,14 +290,54 @@
           <w:p>
             <w:r/>
             <w:r>
-              <w:t xml:space="preserve">Python 3.12+, nur Standardbibliothek · Konsolenapplikation · funktionale Elemente: </w:t>
+              <w:t>Python 3.12, nur Standardbibliothek (</w:t>
             </w:r>
             <w:r>
               <w:rPr>
                 <w:rFonts w:ascii="Consolas" w:hAnsi="Consolas"/>
                 <w:sz w:val="19"/>
               </w:rPr>
-              <w:t>filter</w:t>
+              <w:t>csv</w:t>
+            </w:r>
+            <w:r>
+              <w:t xml:space="preserve">, </w:t>
+            </w:r>
+            <w:r>
+              <w:rPr>
+                <w:rFonts w:ascii="Consolas" w:hAnsi="Consolas"/>
+                <w:sz w:val="19"/>
+              </w:rPr>
+              <w:t>datetime</w:t>
+            </w:r>
+            <w:r>
+              <w:t xml:space="preserve">, </w:t>
+            </w:r>
+            <w:r>
+              <w:rPr>
+                <w:rFonts w:ascii="Consolas" w:hAnsi="Consolas"/>
+                <w:sz w:val="19"/>
+              </w:rPr>
+              <w:t>functools</w:t>
+            </w:r>
+            <w:r>
+              <w:t xml:space="preserve">, </w:t>
+            </w:r>
+            <w:r>
+              <w:rPr>
+                <w:rFonts w:ascii="Consolas" w:hAnsi="Consolas"/>
+                <w:sz w:val="19"/>
+              </w:rPr>
+              <w:t>itertools</w:t>
+            </w:r>
+            <w:r>
+              <w:t xml:space="preserve">) · Konsolenapplikation · funktionale Elemente (V2.0): </w:t>
+            </w:r>
+            <w:r>
+              <w:rPr>
+                <w:rFonts w:ascii="Consolas" w:hAnsi="Consolas"/>
+                <w:sz w:val="19"/>
+              </w:rPr>
+              <w:t>lambda</w:t>
             </w:r>
             <w:r>
               <w:t xml:space="preserve">, </w:t>
@@ -317,10 +357,40 @@
                 <w:rFonts w:ascii="Consolas" w:hAnsi="Consolas"/>
                 <w:sz w:val="19"/>
               </w:rPr>
+              <w:t>filter</w:t>
+            </w:r>
+            <w:r>
+              <w:t xml:space="preserve">, </w:t>
+            </w:r>
+            <w:r>
+              <w:rPr>
+                <w:rFonts w:ascii="Consolas" w:hAnsi="Consolas"/>
+                <w:sz w:val="19"/>
+              </w:rPr>
               <w:t>functools.reduce</w:t>
             </w:r>
             <w:r>
-              <w:t xml:space="preserve">, Lambdas, </w:t>
+              <w:t xml:space="preserve">, List- und Dict-Comprehensions, Generatoren, </w:t>
+            </w:r>
+            <w:r>
+              <w:rPr>
+                <w:rFonts w:ascii="Consolas" w:hAnsi="Consolas"/>
+                <w:sz w:val="19"/>
+              </w:rPr>
+              <w:t>sorted</w:t>
+            </w:r>
+            <w:r>
+              <w:t xml:space="preserve"> mit </w:t>
+            </w:r>
+            <w:r>
+              <w:rPr>
+                <w:rFonts w:ascii="Consolas" w:hAnsi="Consolas"/>
+                <w:sz w:val="19"/>
+              </w:rPr>
+              <w:t>key</w:t>
+            </w:r>
+            <w:r>
+              <w:t xml:space="preserve">, </w:t>
             </w:r>
             <w:r>
               <w:rPr>
@@ -330,7 +400,7 @@
               <w:t>itertools.groupby</w:t>
             </w:r>
             <w:r>
-              <w:t>, Comprehensions</w:t>
+              <w:t>, Funktionen höherer Ordnung</w:t>
             </w:r>
           </w:p>
         </w:tc>
@@ -357,7 +427,7 @@
           <w:p>
             <w:r/>
             <w:r>
-              <w:t>Formatierter Text auf der Konsole, siehe Kapitel 3</w:t>
+              <w:t>Formatierter Output auf die Konsole gemäss Mockup im Antrag (Ranking, Ausfälle pro Tag als Balken, maximale Verspätung pro Kategorie). V1.0 und V2.0 erzeugen exakt denselben Output, siehe Kapitel 3.</w:t>
             </w:r>
           </w:p>
         </w:tc>
@@ -668,7 +738,17 @@
         <w:t>[f(x) for x in daten if bedingung]</w:t>
       </w:r>
       <w:r>
-        <w:t xml:space="preserve"> verbindet Map und Filter in einer Zeile. Mit runden Klammern entsteht ein Generator, der die Werte erst bei Bedarf erzeugt.</w:t>
+        <w:t xml:space="preserve"> verbindet Map und Filter in einer Zeile. Mit geschweiften Klammern entsteht eine Dict-Comprehension (in V2 für die Maxima pro Kategorie: </w:t>
+      </w:r>
+      <w:r>
+        <w:rPr>
+          <w:rFonts w:ascii="Consolas" w:hAnsi="Consolas"/>
+          <w:sz w:val="19"/>
+        </w:rPr>
+        <w:t>{kategorie: reduce(...) for kategorie in KATEGORIEN}</w:t>
+      </w:r>
+      <w:r>
+        <w:t>). Mit runden Klammern entsteht ein Generator, der die Werte erst bei Bedarf erzeugt.</w:t>
       </w:r>
     </w:p>
     <w:p>
@@ -832,71 +912,64 @@
           <w:rFonts w:ascii="Consolas" w:hAnsi="Consolas"/>
           <w:sz w:val="17"/>
         </w:rPr>
-        <w:t>============================================================</w:t>
+        <w:t>=============================================================</w:t>
         <w:br/>
-        <w:t>SBB-Verspätungsanalyse 03.11.2025 – 09.11.2025</w:t>
+        <w:t xml:space="preserve">   SBB Verspätungsanalyse  |  03.11.2025 - 09.11.2025</w:t>
         <w:br/>
-        <w:t>Pünktlich = weniger als 3 Minuten Verspätung</w:t>
-        <w:br/>
-        <w:t>============================================================</w:t>
+        <w:t>=============================================================</w:t>
         <w:br/>
         <w:br/>
-        <w:t>1) Statistik pro Bahnhof</w:t>
+        <w:t>Pünktlichkeit pro Bahnhof (Ranking)</w:t>
         <w:br/>
-        <w:t>Bahnhof        Halte   Ø Verspätung   Pünktlich</w:t>
+        <w:t>-------------------------------------------------------------</w:t>
         <w:br/>
-        <w:t>Basel SBB       2226        1.0 min       90.3%</w:t>
+        <w:t>Rang  Bahnhof         Halte   Ø Verspätung  Pünktlich</w:t>
         <w:br/>
-        <w:t>Bern            7008        0.7 min       95.9%</w:t>
+        <w:t xml:space="preserve">  1   Bern            7'008        0.7 min     95.9 %</w:t>
         <w:br/>
-        <w:t>Liestal         1329        1.1 min       90.9%</w:t>
+        <w:t xml:space="preserve">  2   Olten           4'128        0.8 min     94.4 %</w:t>
         <w:br/>
-        <w:t>Olten           4128        0.8 min       94.4%</w:t>
+        <w:t xml:space="preserve">  3   Zürich HB      11'666        1.1 min     92.4 %</w:t>
         <w:br/>
-        <w:t>Zürich HB      11666        1.1 min       92.4%</w:t>
+        <w:t xml:space="preserve">  4   Liestal         1'329        1.1 min     90.9 %</w:t>
+        <w:br/>
+        <w:t xml:space="preserve">  5   Basel SBB       2'226        1.0 min     90.3 %</w:t>
+        <w:br/>
+        <w:t>(pünktlich = weniger als 3 Minuten Verspätung)</w:t>
         <w:br/>
         <w:br/>
-        <w:t>2) Zugausfälle pro Tag</w:t>
+        <w:t>Zugausfälle pro Tag (# = 2 Ausfälle)</w:t>
         <w:br/>
-        <w:t>03.11.2025     69</w:t>
+        <w:t>-------------------------------------------------------------</w:t>
         <w:br/>
-        <w:t>04.11.2025     39</w:t>
+        <w:t>Mo 03.11.   69   ##################################</w:t>
         <w:br/>
-        <w:t>05.11.2025     35</w:t>
+        <w:t>Di 04.11.   39   ###################</w:t>
         <w:br/>
-        <w:t>06.11.2025     47</w:t>
+        <w:t>Mi 05.11.   35   #################</w:t>
         <w:br/>
-        <w:t>07.11.2025     46</w:t>
+        <w:t>Do 06.11.   47   #######################</w:t>
         <w:br/>
-        <w:t>08.11.2025     67</w:t>
+        <w:t>Fr 07.11.   46   #######################</w:t>
         <w:br/>
-        <w:t>09.11.2025     71</w:t>
+        <w:t>Sa 08.11.   67   #################################</w:t>
         <w:br/>
-        <w:t>Total         374</w:t>
+        <w:t>So 09.11.   71   ###################################</w:t>
         <w:br/>
         <w:br/>
-        <w:t>3) Grösste Verspätung pro Kategorie</w:t>
+        <w:t>Maximale Verspätung pro Zugkategorie</w:t>
         <w:br/>
-        <w:t>S     28.7 min  S12    Zürich HB    03.11.2025</w:t>
+        <w:t>-------------------------------------------------------------</w:t>
         <w:br/>
-        <w:t>RE    17.0 min  RE24   Olten        04.11.2025</w:t>
+        <w:t>IC   58 min   (IC6, Olten, 06.11.)</w:t>
         <w:br/>
-        <w:t>IR    63.0 min  IR37   Zürich HB    03.11.2025</w:t>
+        <w:t>IR   63 min   (IR37, Zürich HB, 03.11.)</w:t>
         <w:br/>
-        <w:t>IC    58.5 min  IC6    Olten        06.11.2025</w:t>
+        <w:t>RE   17 min   (RE24, Olten, 04.11.)</w:t>
         <w:br/>
+        <w:t>S    29 min   (S12, Zürich HB, 03.11.)</w:t>
         <w:br/>
-        <w:t>4) Ranking Pünktlichkeit</w:t>
-        <w:br/>
-        <w:t>1. Bern          95.9%  (Ø 0.7 min)</w:t>
-        <w:br/>
-        <w:t>2. Olten         94.4%  (Ø 0.8 min)</w:t>
-        <w:br/>
-        <w:t>3. Zürich HB     92.4%  (Ø 1.1 min)</w:t>
-        <w:br/>
-        <w:t>4. Liestal       90.9%  (Ø 1.1 min)</w:t>
-        <w:br/>
-        <w:t>5. Basel SBB     90.3%  (Ø 1.0 min)</w:t>
+        <w:t>=============================================================</w:t>
       </w:r>
     </w:p>
     <w:p>

</xml_diff>

<commit_message>
Doku: Anwendungsfälle aus den Lehrbetrieben ergänzen
Co-Authored-By: Claude Opus 5.5 <noreply@anthropic.com>
</commit_message>
<xml_diff>
--- a/docs/dokumentation.docx
+++ b/docs/dokumentation.docx
@@ -54,7 +54,7 @@
       <w:r>
         <w:fldChar w:fldCharType="separate"/>
       </w:r>
-      <w:hyperlink w:anchor="_Toc243464625" w:history="1">
+      <w:hyperlink w:anchor="_Toc243465408" w:history="1">
         <w:r>
           <w:rPr>
             <w:rStyle w:val="Hyperlink"/>
@@ -81,7 +81,7 @@
             <w:noProof/>
             <w:webHidden/>
           </w:rPr>
-          <w:instrText xml:space="preserve"> PAGEREF _Toc243464625 \h </w:instrText>
+          <w:instrText xml:space="preserve"> PAGEREF _Toc243465408 \h </w:instrText>
         </w:r>
         <w:r>
           <w:rPr>
@@ -122,7 +122,7 @@
           <w:noProof/>
         </w:rPr>
       </w:pPr>
-      <w:hyperlink w:anchor="_Toc243464626" w:history="1">
+      <w:hyperlink w:anchor="_Toc243465409" w:history="1">
         <w:r>
           <w:rPr>
             <w:rStyle w:val="Hyperlink"/>
@@ -149,7 +149,7 @@
             <w:noProof/>
             <w:webHidden/>
           </w:rPr>
-          <w:instrText xml:space="preserve"> PAGEREF _Toc243464626 \h </w:instrText>
+          <w:instrText xml:space="preserve"> PAGEREF _Toc243465409 \h </w:instrText>
         </w:r>
         <w:r>
           <w:rPr>
@@ -190,7 +190,7 @@
           <w:noProof/>
         </w:rPr>
       </w:pPr>
-      <w:hyperlink w:anchor="_Toc243464627" w:history="1">
+      <w:hyperlink w:anchor="_Toc243465410" w:history="1">
         <w:r>
           <w:rPr>
             <w:rStyle w:val="Hyperlink"/>
@@ -217,7 +217,7 @@
             <w:noProof/>
             <w:webHidden/>
           </w:rPr>
-          <w:instrText xml:space="preserve"> PAGEREF _Toc243464627 \h </w:instrText>
+          <w:instrText xml:space="preserve"> PAGEREF _Toc243465410 \h </w:instrText>
         </w:r>
         <w:r>
           <w:rPr>
@@ -258,7 +258,7 @@
           <w:noProof/>
         </w:rPr>
       </w:pPr>
-      <w:hyperlink w:anchor="_Toc243464628" w:history="1">
+      <w:hyperlink w:anchor="_Toc243465411" w:history="1">
         <w:r>
           <w:rPr>
             <w:rStyle w:val="Hyperlink"/>
@@ -285,7 +285,7 @@
             <w:noProof/>
             <w:webHidden/>
           </w:rPr>
-          <w:instrText xml:space="preserve"> PAGEREF _Toc243464628 \h </w:instrText>
+          <w:instrText xml:space="preserve"> PAGEREF _Toc243465411 \h </w:instrText>
         </w:r>
         <w:r>
           <w:rPr>
@@ -326,7 +326,7 @@
           <w:noProof/>
         </w:rPr>
       </w:pPr>
-      <w:hyperlink w:anchor="_Toc243464629" w:history="1">
+      <w:hyperlink w:anchor="_Toc243465412" w:history="1">
         <w:r>
           <w:rPr>
             <w:rStyle w:val="Hyperlink"/>
@@ -353,7 +353,7 @@
             <w:noProof/>
             <w:webHidden/>
           </w:rPr>
-          <w:instrText xml:space="preserve"> PAGEREF _Toc243464629 \h </w:instrText>
+          <w:instrText xml:space="preserve"> PAGEREF _Toc243465412 \h </w:instrText>
         </w:r>
         <w:r>
           <w:rPr>
@@ -394,7 +394,7 @@
           <w:noProof/>
         </w:rPr>
       </w:pPr>
-      <w:hyperlink w:anchor="_Toc243464630" w:history="1">
+      <w:hyperlink w:anchor="_Toc243465413" w:history="1">
         <w:r>
           <w:rPr>
             <w:rStyle w:val="Hyperlink"/>
@@ -421,7 +421,7 @@
             <w:noProof/>
             <w:webHidden/>
           </w:rPr>
-          <w:instrText xml:space="preserve"> PAGEREF _Toc243464630 \h </w:instrText>
+          <w:instrText xml:space="preserve"> PAGEREF _Toc243465413 \h </w:instrText>
         </w:r>
         <w:r>
           <w:rPr>
@@ -462,7 +462,7 @@
           <w:noProof/>
         </w:rPr>
       </w:pPr>
-      <w:hyperlink w:anchor="_Toc243464631" w:history="1">
+      <w:hyperlink w:anchor="_Toc243465414" w:history="1">
         <w:r>
           <w:rPr>
             <w:rStyle w:val="Hyperlink"/>
@@ -489,7 +489,7 @@
             <w:noProof/>
             <w:webHidden/>
           </w:rPr>
-          <w:instrText xml:space="preserve"> PAGEREF _Toc243464631 \h </w:instrText>
+          <w:instrText xml:space="preserve"> PAGEREF _Toc243465414 \h </w:instrText>
         </w:r>
         <w:r>
           <w:rPr>
@@ -530,7 +530,7 @@
           <w:noProof/>
         </w:rPr>
       </w:pPr>
-      <w:hyperlink w:anchor="_Toc243464632" w:history="1">
+      <w:hyperlink w:anchor="_Toc243465415" w:history="1">
         <w:r>
           <w:rPr>
             <w:rStyle w:val="Hyperlink"/>
@@ -557,7 +557,7 @@
             <w:noProof/>
             <w:webHidden/>
           </w:rPr>
-          <w:instrText xml:space="preserve"> PAGEREF _Toc243464632 \h </w:instrText>
+          <w:instrText xml:space="preserve"> PAGEREF _Toc243465415 \h </w:instrText>
         </w:r>
         <w:r>
           <w:rPr>
@@ -598,7 +598,7 @@
           <w:noProof/>
         </w:rPr>
       </w:pPr>
-      <w:hyperlink w:anchor="_Toc243464633" w:history="1">
+      <w:hyperlink w:anchor="_Toc243465416" w:history="1">
         <w:r>
           <w:rPr>
             <w:rStyle w:val="Hyperlink"/>
@@ -625,7 +625,7 @@
             <w:noProof/>
             <w:webHidden/>
           </w:rPr>
-          <w:instrText xml:space="preserve"> PAGEREF _Toc243464633 \h </w:instrText>
+          <w:instrText xml:space="preserve"> PAGEREF _Toc243465416 \h </w:instrText>
         </w:r>
         <w:r>
           <w:rPr>
@@ -666,7 +666,7 @@
           <w:noProof/>
         </w:rPr>
       </w:pPr>
-      <w:hyperlink w:anchor="_Toc243464634" w:history="1">
+      <w:hyperlink w:anchor="_Toc243465417" w:history="1">
         <w:r>
           <w:rPr>
             <w:rStyle w:val="Hyperlink"/>
@@ -693,7 +693,7 @@
             <w:noProof/>
             <w:webHidden/>
           </w:rPr>
-          <w:instrText xml:space="preserve"> PAGEREF _Toc243464634 \h </w:instrText>
+          <w:instrText xml:space="preserve"> PAGEREF _Toc243465417 \h </w:instrText>
         </w:r>
         <w:r>
           <w:rPr>
@@ -734,7 +734,7 @@
           <w:noProof/>
         </w:rPr>
       </w:pPr>
-      <w:hyperlink w:anchor="_Toc243464635" w:history="1">
+      <w:hyperlink w:anchor="_Toc243465418" w:history="1">
         <w:r>
           <w:rPr>
             <w:rStyle w:val="Hyperlink"/>
@@ -761,7 +761,7 @@
             <w:noProof/>
             <w:webHidden/>
           </w:rPr>
-          <w:instrText xml:space="preserve"> PAGEREF _Toc243464635 \h </w:instrText>
+          <w:instrText xml:space="preserve"> PAGEREF _Toc243465418 \h </w:instrText>
         </w:r>
         <w:r>
           <w:rPr>
@@ -802,7 +802,7 @@
           <w:noProof/>
         </w:rPr>
       </w:pPr>
-      <w:hyperlink w:anchor="_Toc243464636" w:history="1">
+      <w:hyperlink w:anchor="_Toc243465419" w:history="1">
         <w:r>
           <w:rPr>
             <w:rStyle w:val="Hyperlink"/>
@@ -829,7 +829,7 @@
             <w:noProof/>
             <w:webHidden/>
           </w:rPr>
-          <w:instrText xml:space="preserve"> PAGEREF _Toc243464636 \h </w:instrText>
+          <w:instrText xml:space="preserve"> PAGEREF _Toc243465419 \h </w:instrText>
         </w:r>
         <w:r>
           <w:rPr>
@@ -870,7 +870,7 @@
           <w:noProof/>
         </w:rPr>
       </w:pPr>
-      <w:hyperlink w:anchor="_Toc243464637" w:history="1">
+      <w:hyperlink w:anchor="_Toc243465420" w:history="1">
         <w:r>
           <w:rPr>
             <w:rStyle w:val="Hyperlink"/>
@@ -897,7 +897,7 @@
             <w:noProof/>
             <w:webHidden/>
           </w:rPr>
-          <w:instrText xml:space="preserve"> PAGEREF _Toc243464637 \h </w:instrText>
+          <w:instrText xml:space="preserve"> PAGEREF _Toc243465420 \h </w:instrText>
         </w:r>
         <w:r>
           <w:rPr>
@@ -938,7 +938,7 @@
           <w:noProof/>
         </w:rPr>
       </w:pPr>
-      <w:hyperlink w:anchor="_Toc243464638" w:history="1">
+      <w:hyperlink w:anchor="_Toc243465421" w:history="1">
         <w:r>
           <w:rPr>
             <w:rStyle w:val="Hyperlink"/>
@@ -965,7 +965,7 @@
             <w:noProof/>
             <w:webHidden/>
           </w:rPr>
-          <w:instrText xml:space="preserve"> PAGEREF _Toc243464638 \h </w:instrText>
+          <w:instrText xml:space="preserve"> PAGEREF _Toc243465421 \h </w:instrText>
         </w:r>
         <w:r>
           <w:rPr>
@@ -1006,7 +1006,7 @@
           <w:noProof/>
         </w:rPr>
       </w:pPr>
-      <w:hyperlink w:anchor="_Toc243464639" w:history="1">
+      <w:hyperlink w:anchor="_Toc243465422" w:history="1">
         <w:r>
           <w:rPr>
             <w:rStyle w:val="Hyperlink"/>
@@ -1033,7 +1033,7 @@
             <w:noProof/>
             <w:webHidden/>
           </w:rPr>
-          <w:instrText xml:space="preserve"> PAGEREF _Toc243464639 \h </w:instrText>
+          <w:instrText xml:space="preserve"> PAGEREF _Toc243465422 \h </w:instrText>
         </w:r>
         <w:r>
           <w:rPr>
@@ -1074,7 +1074,7 @@
           <w:noProof/>
         </w:rPr>
       </w:pPr>
-      <w:hyperlink w:anchor="_Toc243464640" w:history="1">
+      <w:hyperlink w:anchor="_Toc243465423" w:history="1">
         <w:r>
           <w:rPr>
             <w:rStyle w:val="Hyperlink"/>
@@ -1101,7 +1101,7 @@
             <w:noProof/>
             <w:webHidden/>
           </w:rPr>
-          <w:instrText xml:space="preserve"> PAGEREF _Toc243464640 \h </w:instrText>
+          <w:instrText xml:space="preserve"> PAGEREF _Toc243465423 \h </w:instrText>
         </w:r>
         <w:r>
           <w:rPr>
@@ -1142,7 +1142,7 @@
           <w:noProof/>
         </w:rPr>
       </w:pPr>
-      <w:hyperlink w:anchor="_Toc243464641" w:history="1">
+      <w:hyperlink w:anchor="_Toc243465424" w:history="1">
         <w:r>
           <w:rPr>
             <w:rStyle w:val="Hyperlink"/>
@@ -1169,7 +1169,7 @@
             <w:noProof/>
             <w:webHidden/>
           </w:rPr>
-          <w:instrText xml:space="preserve"> PAGEREF _Toc243464641 \h </w:instrText>
+          <w:instrText xml:space="preserve"> PAGEREF _Toc243465424 \h </w:instrText>
         </w:r>
         <w:r>
           <w:rPr>
@@ -1210,7 +1210,7 @@
           <w:noProof/>
         </w:rPr>
       </w:pPr>
-      <w:hyperlink w:anchor="_Toc243464642" w:history="1">
+      <w:hyperlink w:anchor="_Toc243465425" w:history="1">
         <w:r>
           <w:rPr>
             <w:rStyle w:val="Hyperlink"/>
@@ -1237,7 +1237,7 @@
             <w:noProof/>
             <w:webHidden/>
           </w:rPr>
-          <w:instrText xml:space="preserve"> PAGEREF _Toc243464642 \h </w:instrText>
+          <w:instrText xml:space="preserve"> PAGEREF _Toc243465425 \h </w:instrText>
         </w:r>
         <w:r>
           <w:rPr>
@@ -1278,7 +1278,7 @@
           <w:noProof/>
         </w:rPr>
       </w:pPr>
-      <w:hyperlink w:anchor="_Toc243464643" w:history="1">
+      <w:hyperlink w:anchor="_Toc243465426" w:history="1">
         <w:r>
           <w:rPr>
             <w:rStyle w:val="Hyperlink"/>
@@ -1305,7 +1305,7 @@
             <w:noProof/>
             <w:webHidden/>
           </w:rPr>
-          <w:instrText xml:space="preserve"> PAGEREF _Toc243464643 \h </w:instrText>
+          <w:instrText xml:space="preserve"> PAGEREF _Toc243465426 \h </w:instrText>
         </w:r>
         <w:r>
           <w:rPr>
@@ -1346,7 +1346,7 @@
           <w:noProof/>
         </w:rPr>
       </w:pPr>
-      <w:hyperlink w:anchor="_Toc243464644" w:history="1">
+      <w:hyperlink w:anchor="_Toc243465427" w:history="1">
         <w:r>
           <w:rPr>
             <w:rStyle w:val="Hyperlink"/>
@@ -1373,7 +1373,7 @@
             <w:noProof/>
             <w:webHidden/>
           </w:rPr>
-          <w:instrText xml:space="preserve"> PAGEREF _Toc243464644 \h </w:instrText>
+          <w:instrText xml:space="preserve"> PAGEREF _Toc243465427 \h </w:instrText>
         </w:r>
         <w:r>
           <w:rPr>
@@ -1393,7 +1393,7 @@
             <w:noProof/>
             <w:webHidden/>
           </w:rPr>
-          <w:t>12</w:t>
+          <w:t>13</w:t>
         </w:r>
         <w:r>
           <w:rPr>
@@ -1418,7 +1418,7 @@
       <w:pPr>
         <w:pStyle w:val="berschrift1"/>
       </w:pPr>
-      <w:bookmarkStart w:id="0" w:name="_Toc243464625"/>
+      <w:bookmarkStart w:id="0" w:name="_Toc243465408"/>
       <w:r>
         <w:lastRenderedPageBreak/>
         <w:t>1. Gewählte Programmiersprache: Python</w:t>
@@ -1429,7 +1429,7 @@
       <w:pPr>
         <w:pStyle w:val="berschrift2"/>
       </w:pPr>
-      <w:bookmarkStart w:id="1" w:name="_Toc243464626"/>
+      <w:bookmarkStart w:id="1" w:name="_Toc243465409"/>
       <w:r>
         <w:t>1.1 Warum Python?</w:t>
       </w:r>
@@ -1478,7 +1478,7 @@
       <w:pPr>
         <w:pStyle w:val="berschrift2"/>
       </w:pPr>
-      <w:bookmarkStart w:id="2" w:name="_Toc243464627"/>
+      <w:bookmarkStart w:id="2" w:name="_Toc243465410"/>
       <w:r>
         <w:t>1.2 Funktionale Sprachelemente von Python</w:t>
       </w:r>
@@ -3030,7 +3030,7 @@
       <w:pPr>
         <w:pStyle w:val="berschrift2"/>
       </w:pPr>
-      <w:bookmarkStart w:id="3" w:name="_Toc243464628"/>
+      <w:bookmarkStart w:id="3" w:name="_Toc243465411"/>
       <w:r>
         <w:t>1.3 Grenzen der funktionalen Programmierung in Python</w:t>
       </w:r>
@@ -3139,7 +3139,7 @@
       <w:pPr>
         <w:pStyle w:val="berschrift2"/>
       </w:pPr>
-      <w:bookmarkStart w:id="4" w:name="_Toc243464629"/>
+      <w:bookmarkStart w:id="4" w:name="_Toc243465412"/>
       <w:r>
         <w:t>1.4 Übersicht: Einsatz in unserem Projekt (V2.0)</w:t>
       </w:r>
@@ -3651,7 +3651,7 @@
       <w:pPr>
         <w:pStyle w:val="berschrift1"/>
       </w:pPr>
-      <w:bookmarkStart w:id="5" w:name="_Toc243464630"/>
+      <w:bookmarkStart w:id="5" w:name="_Toc243465413"/>
       <w:r>
         <w:t>2. Projektantrag</w:t>
       </w:r>
@@ -4050,7 +4050,7 @@
       <w:pPr>
         <w:pStyle w:val="berschrift2"/>
       </w:pPr>
-      <w:bookmarkStart w:id="6" w:name="_Toc243464631"/>
+      <w:bookmarkStart w:id="6" w:name="_Toc243465414"/>
       <w:r>
         <w:t>2.1 Umsetzung und Präzisierungen</w:t>
       </w:r>
@@ -4155,7 +4155,7 @@
       <w:pPr>
         <w:pStyle w:val="berschrift1"/>
       </w:pPr>
-      <w:bookmarkStart w:id="7" w:name="_Toc243464632"/>
+      <w:bookmarkStart w:id="7" w:name="_Toc243465415"/>
       <w:r>
         <w:t>3. Output</w:t>
       </w:r>
@@ -4165,7 +4165,7 @@
       <w:pPr>
         <w:pStyle w:val="berschrift2"/>
       </w:pPr>
-      <w:bookmarkStart w:id="8" w:name="_Toc243464633"/>
+      <w:bookmarkStart w:id="8" w:name="_Toc243465416"/>
       <w:r>
         <w:t>3.1 Programm starten</w:t>
       </w:r>
@@ -4200,7 +4200,7 @@
       <w:pPr>
         <w:pStyle w:val="berschrift2"/>
       </w:pPr>
-      <w:bookmarkStart w:id="9" w:name="_Toc243464634"/>
+      <w:bookmarkStart w:id="9" w:name="_Toc243465417"/>
       <w:r>
         <w:lastRenderedPageBreak/>
         <w:t>3.2 Output Version 1.0</w:t>
@@ -4505,7 +4505,7 @@
       <w:pPr>
         <w:pStyle w:val="berschrift2"/>
       </w:pPr>
-      <w:bookmarkStart w:id="10" w:name="_Toc243464635"/>
+      <w:bookmarkStart w:id="10" w:name="_Toc243465418"/>
       <w:r>
         <w:lastRenderedPageBreak/>
         <w:t>3.3 Output Version 2.0</w:t>
@@ -4845,7 +4845,7 @@
       <w:pPr>
         <w:pStyle w:val="berschrift2"/>
       </w:pPr>
-      <w:bookmarkStart w:id="11" w:name="_Toc243464636"/>
+      <w:bookmarkStart w:id="11" w:name="_Toc243465419"/>
       <w:r>
         <w:t>3.4 So liest man den Output</w:t>
       </w:r>
@@ -4911,7 +4911,7 @@
       <w:pPr>
         <w:pStyle w:val="berschrift1"/>
       </w:pPr>
-      <w:bookmarkStart w:id="12" w:name="_Toc243464637"/>
+      <w:bookmarkStart w:id="12" w:name="_Toc243465420"/>
       <w:r>
         <w:lastRenderedPageBreak/>
         <w:t>4. Fazit</w:t>
@@ -4922,7 +4922,7 @@
       <w:pPr>
         <w:pStyle w:val="berschrift2"/>
       </w:pPr>
-      <w:bookmarkStart w:id="13" w:name="_Toc243464638"/>
+      <w:bookmarkStart w:id="13" w:name="_Toc243465421"/>
       <w:r>
         <w:t>4.1 Vergleich am Beispiel von Funktion 4 (Ausfälle pro Tag)</w:t>
       </w:r>
@@ -5062,7 +5062,7 @@
       <w:pPr>
         <w:pStyle w:val="berschrift2"/>
       </w:pPr>
-      <w:bookmarkStart w:id="14" w:name="_Toc243464639"/>
+      <w:bookmarkStart w:id="14" w:name="_Toc243465422"/>
       <w:r>
         <w:t>4.2 Nutzen für unser Projekt und Unterschied zur imperativen Lösung</w:t>
       </w:r>
@@ -5156,7 +5156,7 @@
       <w:pPr>
         <w:pStyle w:val="berschrift2"/>
       </w:pPr>
-      <w:bookmarkStart w:id="15" w:name="_Toc243464640"/>
+      <w:bookmarkStart w:id="15" w:name="_Toc243465423"/>
       <w:r>
         <w:t>4.3 Hat das Refactoring zu einer Vereinfachung geführt?</w:t>
       </w:r>
@@ -5635,7 +5635,7 @@
       <w:pPr>
         <w:pStyle w:val="berschrift2"/>
       </w:pPr>
-      <w:bookmarkStart w:id="16" w:name="_Toc243464641"/>
+      <w:bookmarkStart w:id="16" w:name="_Toc243465424"/>
       <w:r>
         <w:t>4.4 Würden wir funktionale Elemente wieder verwenden?</w:t>
       </w:r>
@@ -5700,44 +5700,55 @@
       <w:pPr>
         <w:pStyle w:val="berschrift2"/>
       </w:pPr>
-      <w:bookmarkStart w:id="17" w:name="_Toc243464642"/>
+      <w:bookmarkStart w:id="17" w:name="_Toc243465425"/>
       <w:r>
         <w:t>4.5 Anwendungsfälle im Betrieb</w:t>
       </w:r>
       <w:bookmarkEnd w:id="17"/>
     </w:p>
     <w:p>
-      <w:pPr>
-        <w:pStyle w:val="Aufzhlungszeichen"/>
-      </w:pPr>
-      <w:r>
-        <w:t>Log-Dateien und Exporte auswerten: z. B. Fehler aus Server-Logs filtern, nach Datum gruppieren und zählen. Das ist genau das Muster Filter, Map, Reduce aus diesem Projekt.</w:t>
+      <w:r>
+        <w:t xml:space="preserve">Elias (zvoove Switzerland AG): Bei der zvoove Switzerland AG verkaufen wir eine Hauptsoftware und dazu verschiedene Add-ons, und wenn Daten zwischen der Hauptsoftware und einem Add-on ausgetauscht werden, könnte man sie mit </w:t>
+      </w:r>
+      <w:r>
+        <w:rPr>
+          <w:rFonts w:ascii="Consolas" w:hAnsi="Consolas"/>
+          <w:sz w:val="19"/>
+        </w:rPr>
+        <w:t>filter</w:t>
+      </w:r>
+      <w:r>
+        <w:t xml:space="preserve"> auf die relevanten Datensätze einschränken, mit </w:t>
+      </w:r>
+      <w:r>
+        <w:rPr>
+          <w:rFonts w:ascii="Consolas" w:hAnsi="Consolas"/>
+          <w:sz w:val="19"/>
+        </w:rPr>
+        <w:t>map</w:t>
+      </w:r>
+      <w:r>
+        <w:t xml:space="preserve"> in das Format des Add-ons umwandeln und mit </w:t>
+      </w:r>
+      <w:r>
+        <w:rPr>
+          <w:rFonts w:ascii="Consolas" w:hAnsi="Consolas"/>
+          <w:sz w:val="19"/>
+        </w:rPr>
+        <w:t>reduce</w:t>
+      </w:r>
+      <w:r>
+        <w:t xml:space="preserve"> zum Beispiel pro Kunde zusammenfassen, also genau das Muster Filter, Map, Reduce aus unserem Projekt.</w:t>
       </w:r>
     </w:p>
     <w:p>
-      <w:pPr>
-        <w:pStyle w:val="Aufzhlungszeichen"/>
-      </w:pPr>
-      <w:r>
-        <w:t xml:space="preserve">Datenbereinigung vor einem Import: CSV- oder Excel-Exporte aus Fachanwendungen mit kleinen, puren Funktionen prüfen und umwandeln, bevor sie in eine Datenbank geschrieben werden. Ungültige Zeilen filtern, Formate (Datum, Telefonnummern) mit </w:t>
-      </w:r>
-      <w:r>
-        <w:rPr>
-          <w:rFonts w:ascii="Consolas" w:hAnsi="Consolas"/>
-          <w:sz w:val="19"/>
-        </w:rPr>
-        <w:t>map</w:t>
-      </w:r>
-      <w:r>
-        <w:t xml:space="preserve"> vereinheitlichen.</w:t>
+      <w:r>
+        <w:t>Aimen (Kanton Basel-Stadt): Der Kanton Basel-Stadt veröffentlicht viele Daten auf data.bs.ch, und solche Datensätze, zum Beispiel Verkehrszählungen oder Messwerte, könnte man genau wie die SBB-Daten mit kleinen, puren Funktionen filtern, umrechnen und pro Quartier oder Monat zusammenfassen, bevor sie in einem Bericht oder auf dem Portal erscheinen.</w:t>
       </w:r>
     </w:p>
     <w:p>
-      <w:pPr>
-        <w:pStyle w:val="Aufzhlungszeichen"/>
-      </w:pPr>
-      <w:r>
-        <w:t>API-Antworten (JSON) umbauen: Listen von Objekten aus einer REST-API in die Struktur bringen, die das Frontend oder ein Bericht braucht (List- und Dict-Comprehensions).</w:t>
+      <w:r>
+        <w:t>Weitere allgemeine Anwendungsfälle:</w:t>
       </w:r>
     </w:p>
     <w:p>
@@ -5745,17 +5756,7 @@
         <w:pStyle w:val="Aufzhlungszeichen"/>
       </w:pPr>
       <w:r>
-        <w:t xml:space="preserve">Validierungsregeln: Regeln als kleine Funktionen schreiben und mit </w:t>
-      </w:r>
-      <w:r>
-        <w:rPr>
-          <w:rFonts w:ascii="Consolas" w:hAnsi="Consolas"/>
-          <w:sz w:val="19"/>
-        </w:rPr>
-        <w:t>all(regel(eingabe) for regel in regeln)</w:t>
-      </w:r>
-      <w:r>
-        <w:t xml:space="preserve"> kombinieren; neue Regeln lassen sich hinzufügen, ohne bestehenden Code zu ändern.</w:t>
+        <w:t>Log-Dateien und Exporte auswerten: z. B. Fehler aus Server-Logs filtern, nach Datum gruppieren und zählen.</w:t>
       </w:r>
     </w:p>
     <w:p>
@@ -5763,14 +5764,58 @@
         <w:pStyle w:val="Aufzhlungszeichen"/>
       </w:pPr>
       <w:r>
-        <w:t>Berichte und Statistiken: z. B. Auswertungen von Tickets, Zeiterfassungen oder Inventardaten pro Abteilung, Monat oder Kategorie.</w:t>
+        <w:t xml:space="preserve">Datenbereinigung vor einem Import: CSV- oder Excel-Exporte aus Fachanwendungen mit kleinen, puren Funktionen prüfen und umwandeln, bevor sie in eine Datenbank geschrieben werden. Ungültige Zeilen filtern, Formate (Datum, Telefonnummern) mit </w:t>
+      </w:r>
+      <w:r>
+        <w:rPr>
+          <w:rFonts w:ascii="Consolas" w:hAnsi="Consolas"/>
+          <w:sz w:val="19"/>
+        </w:rPr>
+        <w:t>map</w:t>
+      </w:r>
+      <w:r>
+        <w:t xml:space="preserve"> vereinheitlichen.</w:t>
       </w:r>
     </w:p>
     <w:p>
       <w:pPr>
+        <w:pStyle w:val="Aufzhlungszeichen"/>
+      </w:pPr>
+      <w:r>
+        <w:t>API-Antworten (JSON) umbauen: Listen von Objekten aus einer REST-API in die Struktur bringen, die das Frontend oder ein Bericht braucht (List- und Dict-Comprehensions).</w:t>
+      </w:r>
+    </w:p>
+    <w:p>
+      <w:pPr>
+        <w:pStyle w:val="Aufzhlungszeichen"/>
+      </w:pPr>
+      <w:r>
+        <w:t xml:space="preserve">Validierungsregeln: Regeln als kleine Funktionen schreiben und mit </w:t>
+      </w:r>
+      <w:r>
+        <w:rPr>
+          <w:rFonts w:ascii="Consolas" w:hAnsi="Consolas"/>
+          <w:sz w:val="19"/>
+        </w:rPr>
+        <w:t>all(regel(eingabe) for regel in regeln)</w:t>
+      </w:r>
+      <w:r>
+        <w:t xml:space="preserve"> kombinieren; neue Regeln lassen sich hinzufügen, ohne bestehenden Code zu ändern.</w:t>
+      </w:r>
+    </w:p>
+    <w:p>
+      <w:pPr>
+        <w:pStyle w:val="Aufzhlungszeichen"/>
+      </w:pPr>
+      <w:r>
+        <w:t>Berichte und Statistiken: z. B. Auswertungen von Tickets, Zeiterfassungen oder Inventardaten pro Abteilung, Monat oder Kategorie.</w:t>
+      </w:r>
+    </w:p>
+    <w:p>
+      <w:pPr>
         <w:pStyle w:val="berschrift1"/>
       </w:pPr>
-      <w:bookmarkStart w:id="18" w:name="_Toc243464643"/>
+      <w:bookmarkStart w:id="18" w:name="_Toc243465426"/>
       <w:r>
         <w:t>5. Quellen</w:t>
       </w:r>
@@ -5949,6 +5994,7 @@
         <w:pStyle w:val="Aufzhlungszeichen"/>
       </w:pPr>
       <w:r>
+        <w:lastRenderedPageBreak/>
         <w:t xml:space="preserve">Python Software Foundation: </w:t>
       </w:r>
       <w:r>
@@ -6021,7 +6067,7 @@
       <w:pPr>
         <w:pStyle w:val="berschrift1"/>
       </w:pPr>
-      <w:bookmarkStart w:id="19" w:name="_Toc243464644"/>
+      <w:bookmarkStart w:id="19" w:name="_Toc243465427"/>
       <w:r>
         <w:lastRenderedPageBreak/>
         <w:t>Anhang: Genehmigter Projektantrag</w:t>
@@ -6034,7 +6080,7 @@
           <w:noProof/>
         </w:rPr>
         <w:drawing>
-          <wp:inline distT="0" distB="0" distL="0" distR="0" wp14:anchorId="68CFBE2A" wp14:editId="04BF3A63">
+          <wp:inline distT="0" distB="0" distL="0" distR="0" wp14:anchorId="3B33E583" wp14:editId="50F8B558">
             <wp:extent cx="5580000" cy="7893000"/>
             <wp:effectExtent l="0" t="0" r="0" b="0"/>
             <wp:docPr id="1" name="Picture 1"/>
@@ -6077,7 +6123,7 @@
         </w:rPr>
         <w:lastRenderedPageBreak/>
         <w:drawing>
-          <wp:inline distT="0" distB="0" distL="0" distR="0" wp14:anchorId="372F955F" wp14:editId="37823A33">
+          <wp:inline distT="0" distB="0" distL="0" distR="0" wp14:anchorId="7051DA3E" wp14:editId="0F2E5E3C">
             <wp:extent cx="5580000" cy="7893000"/>
             <wp:effectExtent l="0" t="0" r="0" b="0"/>
             <wp:docPr id="2" name="Picture 2"/>
@@ -6296,31 +6342,31 @@
       </w:rPr>
     </w:lvl>
   </w:abstractNum>
-  <w:num w:numId="1" w16cid:durableId="744255506">
+  <w:num w:numId="1" w16cid:durableId="415132020">
     <w:abstractNumId w:val="8"/>
   </w:num>
-  <w:num w:numId="2" w16cid:durableId="831408745">
+  <w:num w:numId="2" w16cid:durableId="867833752">
     <w:abstractNumId w:val="6"/>
   </w:num>
-  <w:num w:numId="3" w16cid:durableId="1115245519">
+  <w:num w:numId="3" w16cid:durableId="2111120573">
     <w:abstractNumId w:val="5"/>
   </w:num>
-  <w:num w:numId="4" w16cid:durableId="1555847163">
+  <w:num w:numId="4" w16cid:durableId="73208517">
     <w:abstractNumId w:val="4"/>
   </w:num>
-  <w:num w:numId="5" w16cid:durableId="832373343">
+  <w:num w:numId="5" w16cid:durableId="613709589">
     <w:abstractNumId w:val="7"/>
   </w:num>
-  <w:num w:numId="6" w16cid:durableId="636840732">
+  <w:num w:numId="6" w16cid:durableId="198589853">
     <w:abstractNumId w:val="3"/>
   </w:num>
-  <w:num w:numId="7" w16cid:durableId="2021811124">
+  <w:num w:numId="7" w16cid:durableId="916062845">
     <w:abstractNumId w:val="2"/>
   </w:num>
-  <w:num w:numId="8" w16cid:durableId="1030761918">
+  <w:num w:numId="8" w16cid:durableId="1232346775">
     <w:abstractNumId w:val="1"/>
   </w:num>
-  <w:num w:numId="9" w16cid:durableId="1919946691">
+  <w:num w:numId="9" w16cid:durableId="1654026421">
     <w:abstractNumId w:val="0"/>
   </w:num>
 </w:numbering>
@@ -17712,7 +17758,7 @@
     <w:autoRedefine/>
     <w:uiPriority w:val="39"/>
     <w:unhideWhenUsed/>
-    <w:rsid w:val="005D7CA0"/>
+    <w:rsid w:val="00D45A7E"/>
     <w:pPr>
       <w:spacing w:after="100"/>
     </w:pPr>
@@ -17724,7 +17770,7 @@
     <w:autoRedefine/>
     <w:uiPriority w:val="39"/>
     <w:unhideWhenUsed/>
-    <w:rsid w:val="005D7CA0"/>
+    <w:rsid w:val="00D45A7E"/>
     <w:pPr>
       <w:spacing w:after="100"/>
       <w:ind w:left="210"/>
@@ -17735,7 +17781,7 @@
     <w:basedOn w:val="Absatz-Standardschriftart"/>
     <w:uiPriority w:val="99"/>
     <w:unhideWhenUsed/>
-    <w:rsid w:val="005D7CA0"/>
+    <w:rsid w:val="00D45A7E"/>
     <w:rPr>
       <w:color w:val="0000FF" w:themeColor="hyperlink"/>
       <w:u w:val="single"/>

</xml_diff>